<commit_message>
Add demo script + live links; rewrite README with storyline; update PRD and HANDOUT
- README: absurd-journey hook, trust-machine reframe, hero flow, live demo link,
  four AI modes, real vs mocked, architecture, deploy
- RELAY_Demo_Script.md: 4m30s shot-by-shot demo video script
- HANDOUT: Session 7 (deployed to Vercel+Render, idempotent grading, live URLs)
- PRD Document.docx: final content updates
</commit_message>
<xml_diff>
--- a/PRD Document.docx
+++ b/PRD Document.docx
@@ -119,7 +119,25 @@
           <w:sz w:val="20"/>
           <w:szCs w:val="20"/>
         </w:rPr>
-        <w:t xml:space="preserve">48-Hour Hackathon  |  Solution Document  </w:t>
+        <w:t xml:space="preserve">48-Hour </w:t>
+      </w:r>
+      <w:proofErr w:type="gramStart"/>
+      <w:r>
+        <w:rPr>
+          <w:color w:val="999999"/>
+          <w:sz w:val="20"/>
+          <w:szCs w:val="20"/>
+        </w:rPr>
+        <w:t>Hackathon  |</w:t>
+      </w:r>
+      <w:proofErr w:type="gramEnd"/>
+      <w:r>
+        <w:rPr>
+          <w:color w:val="999999"/>
+          <w:sz w:val="20"/>
+          <w:szCs w:val="20"/>
+        </w:rPr>
+        <w:t xml:space="preserve">  Solution Document  </w:t>
       </w:r>
     </w:p>
     <w:p>
@@ -601,22 +619,6 @@
     </w:p>
     <w:p>
       <w:pPr>
-        <w:spacing w:before="60" w:after="60"/>
-        <w:ind w:left="270"/>
-      </w:pPr>
-      <w:r>
-        <w:rPr>
-          <w:i/>
-          <w:iCs/>
-          <w:color w:val="999999"/>
-          <w:sz w:val="19"/>
-          <w:szCs w:val="19"/>
-        </w:rPr>
-        <w:t>→ Tip: Show global scale. Problems affecting millions score higher than niche issues.</w:t>
-      </w:r>
-    </w:p>
-    <w:p>
-      <w:pPr>
         <w:pStyle w:val="Heading2"/>
       </w:pPr>
       <w:r>
@@ -752,6 +754,9 @@
       <w:pPr>
         <w:pStyle w:val="Heading2"/>
       </w:pPr>
+      <w:r>
+        <w:t xml:space="preserve">            </w:t>
+      </w:r>
       <w:r>
         <w:rPr>
           <w:b w:val="0"/>
@@ -763,8 +768,8 @@
           <w:szCs w:val="19"/>
         </w:rPr>
         <w:drawing>
-          <wp:inline distT="0" distB="0" distL="0" distR="0" wp14:anchorId="4CEBBBD4" wp14:editId="2A2504A7">
-            <wp:extent cx="5286375" cy="3114675"/>
+          <wp:inline distT="0" distB="0" distL="0" distR="0" wp14:anchorId="4CEBBBD4" wp14:editId="7F194878">
+            <wp:extent cx="5286375" cy="3733800"/>
             <wp:effectExtent l="0" t="0" r="0" b="0"/>
             <wp:docPr id="2111775534" name="Picture 1"/>
             <wp:cNvGraphicFramePr>
@@ -786,7 +791,7 @@
                   <pic:spPr>
                     <a:xfrm>
                       <a:off x="0" y="0"/>
-                      <a:ext cx="5294612" cy="3119528"/>
+                      <a:ext cx="5294616" cy="3739621"/>
                     </a:xfrm>
                     <a:prstGeom prst="rect">
                       <a:avLst/>
@@ -809,7 +814,6 @@
         <w:pStyle w:val="Heading2"/>
       </w:pPr>
       <w:r>
-        <w:lastRenderedPageBreak/>
         <w:t>Working Prototype</w:t>
       </w:r>
     </w:p>
@@ -818,7 +822,7 @@
         <w:spacing w:before="40" w:after="40"/>
       </w:pPr>
       <w:r>
-        <w:t>Working end to end today across three surfaces: a seller app, a buyer app, and a live ops dashboard. The doorstep scan, fingerprint match, AI grading certificate, fraud interrupt, buyer map, and the final journey screen all run on real calls, with a cached fallback so the demo never breaks offline. (Insert 2 to 3 screenshots: the grade certificate, the red fraud interrupt, and the buyer map.)</w:t>
+        <w:t xml:space="preserve">Working end to end today across three surfaces: a seller app, a buyer app, and a live ops dashboard. The doorstep scan, fingerprint match, AI grading certificate, fraud interrupt, buyer map, and the final journey screen all run on real calls, with a cached fallback so the demo never breaks offline. </w:t>
       </w:r>
     </w:p>
     <w:p>
@@ -826,7 +830,243 @@
         <w:spacing w:before="60" w:after="60"/>
       </w:pPr>
       <w:r>
-        <w:t>Demo: Video to be added</w:t>
+        <w:rPr>
+          <w:noProof/>
+        </w:rPr>
+        <w:drawing>
+          <wp:inline distT="0" distB="0" distL="0" distR="0" wp14:anchorId="510AFCAC" wp14:editId="71C37ECC">
+            <wp:extent cx="1749425" cy="3543247"/>
+            <wp:effectExtent l="0" t="0" r="3175" b="635"/>
+            <wp:docPr id="1809749032" name="Picture 1"/>
+            <wp:cNvGraphicFramePr>
+              <a:graphicFrameLocks xmlns:a="http://schemas.openxmlformats.org/drawingml/2006/main" noChangeAspect="1"/>
+            </wp:cNvGraphicFramePr>
+            <a:graphic xmlns:a="http://schemas.openxmlformats.org/drawingml/2006/main">
+              <a:graphicData uri="http://schemas.openxmlformats.org/drawingml/2006/picture">
+                <pic:pic xmlns:pic="http://schemas.openxmlformats.org/drawingml/2006/picture">
+                  <pic:nvPicPr>
+                    <pic:cNvPr id="1809749032" name=""/>
+                    <pic:cNvPicPr/>
+                  </pic:nvPicPr>
+                  <pic:blipFill rotWithShape="1">
+                    <a:blip r:embed="rId9"/>
+                    <a:srcRect t="1326"/>
+                    <a:stretch>
+                      <a:fillRect/>
+                    </a:stretch>
+                  </pic:blipFill>
+                  <pic:spPr bwMode="auto">
+                    <a:xfrm>
+                      <a:off x="0" y="0"/>
+                      <a:ext cx="1752833" cy="3550149"/>
+                    </a:xfrm>
+                    <a:prstGeom prst="rect">
+                      <a:avLst/>
+                    </a:prstGeom>
+                    <a:ln>
+                      <a:noFill/>
+                    </a:ln>
+                    <a:extLst>
+                      <a:ext uri="{53640926-AAD7-44D8-BBD7-CCE9431645EC}">
+                        <a14:shadowObscured xmlns:a14="http://schemas.microsoft.com/office/drawing/2010/main"/>
+                      </a:ext>
+                    </a:extLst>
+                  </pic:spPr>
+                </pic:pic>
+              </a:graphicData>
+            </a:graphic>
+          </wp:inline>
+        </w:drawing>
+      </w:r>
+      <w:r>
+        <w:t xml:space="preserve">     </w:t>
+      </w:r>
+      <w:r>
+        <w:t xml:space="preserve">      </w:t>
+      </w:r>
+      <w:r>
+        <w:rPr>
+          <w:noProof/>
+        </w:rPr>
+        <w:drawing>
+          <wp:inline distT="0" distB="0" distL="0" distR="0" wp14:anchorId="243CB9AC" wp14:editId="2575280F">
+            <wp:extent cx="1752579" cy="3528060"/>
+            <wp:effectExtent l="0" t="0" r="635" b="0"/>
+            <wp:docPr id="2128816568" name="Picture 1"/>
+            <wp:cNvGraphicFramePr>
+              <a:graphicFrameLocks xmlns:a="http://schemas.openxmlformats.org/drawingml/2006/main" noChangeAspect="1"/>
+            </wp:cNvGraphicFramePr>
+            <a:graphic xmlns:a="http://schemas.openxmlformats.org/drawingml/2006/main">
+              <a:graphicData uri="http://schemas.openxmlformats.org/drawingml/2006/picture">
+                <pic:pic xmlns:pic="http://schemas.openxmlformats.org/drawingml/2006/picture">
+                  <pic:nvPicPr>
+                    <pic:cNvPr id="2128816568" name=""/>
+                    <pic:cNvPicPr/>
+                  </pic:nvPicPr>
+                  <pic:blipFill rotWithShape="1">
+                    <a:blip r:embed="rId10"/>
+                    <a:srcRect t="2372"/>
+                    <a:stretch>
+                      <a:fillRect/>
+                    </a:stretch>
+                  </pic:blipFill>
+                  <pic:spPr bwMode="auto">
+                    <a:xfrm>
+                      <a:off x="0" y="0"/>
+                      <a:ext cx="1758043" cy="3539060"/>
+                    </a:xfrm>
+                    <a:prstGeom prst="rect">
+                      <a:avLst/>
+                    </a:prstGeom>
+                    <a:ln>
+                      <a:noFill/>
+                    </a:ln>
+                    <a:extLst>
+                      <a:ext uri="{53640926-AAD7-44D8-BBD7-CCE9431645EC}">
+                        <a14:shadowObscured xmlns:a14="http://schemas.microsoft.com/office/drawing/2010/main"/>
+                      </a:ext>
+                    </a:extLst>
+                  </pic:spPr>
+                </pic:pic>
+              </a:graphicData>
+            </a:graphic>
+          </wp:inline>
+        </w:drawing>
+      </w:r>
+      <w:r>
+        <w:t xml:space="preserve">              </w:t>
+      </w:r>
+      <w:r>
+        <w:rPr>
+          <w:noProof/>
+        </w:rPr>
+        <w:drawing>
+          <wp:inline distT="0" distB="0" distL="0" distR="0" wp14:anchorId="74191799" wp14:editId="019F041D">
+            <wp:extent cx="1733550" cy="3581400"/>
+            <wp:effectExtent l="0" t="0" r="0" b="0"/>
+            <wp:docPr id="945749759" name="Picture 5"/>
+            <wp:cNvGraphicFramePr>
+              <a:graphicFrameLocks xmlns:a="http://schemas.openxmlformats.org/drawingml/2006/main" noChangeAspect="1"/>
+            </wp:cNvGraphicFramePr>
+            <a:graphic xmlns:a="http://schemas.openxmlformats.org/drawingml/2006/main">
+              <a:graphicData uri="http://schemas.openxmlformats.org/drawingml/2006/picture">
+                <pic:pic xmlns:pic="http://schemas.openxmlformats.org/drawingml/2006/picture">
+                  <pic:nvPicPr>
+                    <pic:cNvPr id="0" name="Picture 3"/>
+                    <pic:cNvPicPr>
+                      <a:picLocks noChangeAspect="1" noChangeArrowheads="1"/>
+                    </pic:cNvPicPr>
+                  </pic:nvPicPr>
+                  <pic:blipFill rotWithShape="1">
+                    <a:blip r:embed="rId11" cstate="print">
+                      <a:extLst>
+                        <a:ext uri="{28A0092B-C50C-407E-A947-70E740481C1C}">
+                          <a14:useLocalDpi xmlns:a14="http://schemas.microsoft.com/office/drawing/2010/main" val="0"/>
+                        </a:ext>
+                      </a:extLst>
+                    </a:blip>
+                    <a:srcRect l="5932" t="1317" r="4082" b="-368"/>
+                    <a:stretch>
+                      <a:fillRect/>
+                    </a:stretch>
+                  </pic:blipFill>
+                  <pic:spPr bwMode="auto">
+                    <a:xfrm>
+                      <a:off x="0" y="0"/>
+                      <a:ext cx="1743461" cy="3601875"/>
+                    </a:xfrm>
+                    <a:prstGeom prst="rect">
+                      <a:avLst/>
+                    </a:prstGeom>
+                    <a:noFill/>
+                    <a:ln>
+                      <a:noFill/>
+                    </a:ln>
+                    <a:extLst>
+                      <a:ext uri="{53640926-AAD7-44D8-BBD7-CCE9431645EC}">
+                        <a14:shadowObscured xmlns:a14="http://schemas.microsoft.com/office/drawing/2010/main"/>
+                      </a:ext>
+                    </a:extLst>
+                  </pic:spPr>
+                </pic:pic>
+              </a:graphicData>
+            </a:graphic>
+          </wp:inline>
+        </w:drawing>
+      </w:r>
+      <w:r>
+        <w:rPr>
+          <w:noProof/>
+        </w:rPr>
+        <mc:AlternateContent>
+          <mc:Choice Requires="wps">
+            <w:drawing>
+              <wp:inline distT="0" distB="0" distL="0" distR="0" wp14:anchorId="2B1750BB" wp14:editId="534CDC40">
+                <wp:extent cx="304800" cy="304800"/>
+                <wp:effectExtent l="0" t="0" r="0" b="0"/>
+                <wp:docPr id="2021817325" name="Rectangle 1"/>
+                <wp:cNvGraphicFramePr>
+                  <a:graphicFrameLocks xmlns:a="http://schemas.openxmlformats.org/drawingml/2006/main" noChangeAspect="1"/>
+                </wp:cNvGraphicFramePr>
+                <a:graphic xmlns:a="http://schemas.openxmlformats.org/drawingml/2006/main">
+                  <a:graphicData uri="http://schemas.microsoft.com/office/word/2010/wordprocessingShape">
+                    <wps:wsp>
+                      <wps:cNvSpPr>
+                        <a:spLocks noChangeAspect="1" noChangeArrowheads="1"/>
+                      </wps:cNvSpPr>
+                      <wps:spPr bwMode="auto">
+                        <a:xfrm>
+                          <a:off x="0" y="0"/>
+                          <a:ext cx="304800" cy="304800"/>
+                        </a:xfrm>
+                        <a:prstGeom prst="rect">
+                          <a:avLst/>
+                        </a:prstGeom>
+                        <a:noFill/>
+                        <a:ln>
+                          <a:noFill/>
+                        </a:ln>
+                        <a:extLst>
+                          <a:ext uri="{909E8E84-426E-40DD-AFC4-6F175D3DCCD1}">
+                            <a14:hiddenFill xmlns:a14="http://schemas.microsoft.com/office/drawing/2010/main">
+                              <a:solidFill>
+                                <a:srgbClr val="FFFFFF"/>
+                              </a:solidFill>
+                            </a14:hiddenFill>
+                          </a:ext>
+                          <a:ext uri="{91240B29-F687-4F45-9708-019B960494DF}">
+                            <a14:hiddenLine xmlns:a14="http://schemas.microsoft.com/office/drawing/2010/main" w="9525">
+                              <a:solidFill>
+                                <a:srgbClr val="000000"/>
+                              </a:solidFill>
+                              <a:miter lim="800000"/>
+                              <a:headEnd/>
+                              <a:tailEnd/>
+                            </a14:hiddenLine>
+                          </a:ext>
+                        </a:extLst>
+                      </wps:spPr>
+                      <wps:bodyPr rot="0" vert="horz" wrap="square" lIns="91440" tIns="45720" rIns="91440" bIns="45720" anchor="t" anchorCtr="0" upright="1">
+                        <a:noAutofit/>
+                      </wps:bodyPr>
+                    </wps:wsp>
+                  </a:graphicData>
+                </a:graphic>
+              </wp:inline>
+            </w:drawing>
+          </mc:Choice>
+          <mc:Fallback>
+            <w:pict>
+              <v:rect w14:anchorId="034049CE" id="Rectangle 1" o:spid="_x0000_s1026" style="width:24pt;height:24pt;visibility:visible;mso-wrap-style:square;mso-left-percent:-10001;mso-top-percent:-10001;mso-position-horizontal:absolute;mso-position-horizontal-relative:char;mso-position-vertical:absolute;mso-position-vertical-relative:line;mso-left-percent:-10001;mso-top-percent:-10001;v-text-anchor:top" o:gfxdata="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" filled="f" stroked="f">
+                <o:lock v:ext="edit" aspectratio="t"/>
+                <w10:anchorlock/>
+              </v:rect>
+            </w:pict>
+          </mc:Fallback>
+        </mc:AlternateContent>
+      </w:r>
+      <w:r>
+        <w:t xml:space="preserve">    </w:t>
       </w:r>
     </w:p>
     <w:p>
@@ -835,19 +1075,180 @@
       </w:pPr>
       <w:r>
         <w:rPr>
-          <w:i/>
-          <w:iCs/>
-          <w:color w:val="999999"/>
-          <w:sz w:val="19"/>
-          <w:szCs w:val="19"/>
+          <w:noProof/>
         </w:rPr>
-        <w:t>.</w:t>
-      </w:r>
-    </w:p>
-    <w:p>
-      <w:r>
-        <w:br w:type="page"/>
-      </w:r>
+        <w:drawing>
+          <wp:inline distT="0" distB="0" distL="0" distR="0" wp14:anchorId="1EF33B0C" wp14:editId="193AD8E2">
+            <wp:extent cx="1685925" cy="3400425"/>
+            <wp:effectExtent l="0" t="0" r="9525" b="0"/>
+            <wp:docPr id="1979415504" name="Picture 6"/>
+            <wp:cNvGraphicFramePr>
+              <a:graphicFrameLocks xmlns:a="http://schemas.openxmlformats.org/drawingml/2006/main" noChangeAspect="1"/>
+            </wp:cNvGraphicFramePr>
+            <a:graphic xmlns:a="http://schemas.openxmlformats.org/drawingml/2006/main">
+              <a:graphicData uri="http://schemas.openxmlformats.org/drawingml/2006/picture">
+                <pic:pic xmlns:pic="http://schemas.openxmlformats.org/drawingml/2006/picture">
+                  <pic:nvPicPr>
+                    <pic:cNvPr id="0" name="Picture 27"/>
+                    <pic:cNvPicPr>
+                      <a:picLocks noChangeAspect="1" noChangeArrowheads="1"/>
+                    </pic:cNvPicPr>
+                  </pic:nvPicPr>
+                  <pic:blipFill rotWithShape="1">
+                    <a:blip r:embed="rId12" cstate="print">
+                      <a:extLst>
+                        <a:ext uri="{28A0092B-C50C-407E-A947-70E740481C1C}">
+                          <a14:useLocalDpi xmlns:a14="http://schemas.microsoft.com/office/drawing/2010/main" val="0"/>
+                        </a:ext>
+                      </a:extLst>
+                    </a:blip>
+                    <a:srcRect l="4189" t="1356" r="3108" b="1801"/>
+                    <a:stretch>
+                      <a:fillRect/>
+                    </a:stretch>
+                  </pic:blipFill>
+                  <pic:spPr bwMode="auto">
+                    <a:xfrm>
+                      <a:off x="0" y="0"/>
+                      <a:ext cx="1689514" cy="3407663"/>
+                    </a:xfrm>
+                    <a:prstGeom prst="rect">
+                      <a:avLst/>
+                    </a:prstGeom>
+                    <a:noFill/>
+                    <a:ln>
+                      <a:noFill/>
+                    </a:ln>
+                    <a:extLst>
+                      <a:ext uri="{53640926-AAD7-44D8-BBD7-CCE9431645EC}">
+                        <a14:shadowObscured xmlns:a14="http://schemas.microsoft.com/office/drawing/2010/main"/>
+                      </a:ext>
+                    </a:extLst>
+                  </pic:spPr>
+                </pic:pic>
+              </a:graphicData>
+            </a:graphic>
+          </wp:inline>
+        </w:drawing>
+      </w:r>
+      <w:r>
+        <w:t xml:space="preserve">        </w:t>
+      </w:r>
+      <w:r>
+        <w:drawing>
+          <wp:inline distT="0" distB="0" distL="0" distR="0" wp14:anchorId="58A5FF9F" wp14:editId="57220DE6">
+            <wp:extent cx="1714500" cy="3419475"/>
+            <wp:effectExtent l="0" t="0" r="0" b="9525"/>
+            <wp:docPr id="128844609" name="Picture 1"/>
+            <wp:cNvGraphicFramePr>
+              <a:graphicFrameLocks xmlns:a="http://schemas.openxmlformats.org/drawingml/2006/main" noChangeAspect="1"/>
+            </wp:cNvGraphicFramePr>
+            <a:graphic xmlns:a="http://schemas.openxmlformats.org/drawingml/2006/main">
+              <a:graphicData uri="http://schemas.openxmlformats.org/drawingml/2006/picture">
+                <pic:pic xmlns:pic="http://schemas.openxmlformats.org/drawingml/2006/picture">
+                  <pic:nvPicPr>
+                    <pic:cNvPr id="128844609" name=""/>
+                    <pic:cNvPicPr/>
+                  </pic:nvPicPr>
+                  <pic:blipFill rotWithShape="1">
+                    <a:blip r:embed="rId13"/>
+                    <a:srcRect l="2152" r="1000" b="303"/>
+                    <a:stretch>
+                      <a:fillRect/>
+                    </a:stretch>
+                  </pic:blipFill>
+                  <pic:spPr bwMode="auto">
+                    <a:xfrm>
+                      <a:off x="0" y="0"/>
+                      <a:ext cx="1725297" cy="3441009"/>
+                    </a:xfrm>
+                    <a:prstGeom prst="rect">
+                      <a:avLst/>
+                    </a:prstGeom>
+                    <a:ln>
+                      <a:noFill/>
+                    </a:ln>
+                    <a:extLst>
+                      <a:ext uri="{53640926-AAD7-44D8-BBD7-CCE9431645EC}">
+                        <a14:shadowObscured xmlns:a14="http://schemas.microsoft.com/office/drawing/2010/main"/>
+                      </a:ext>
+                    </a:extLst>
+                  </pic:spPr>
+                </pic:pic>
+              </a:graphicData>
+            </a:graphic>
+          </wp:inline>
+        </w:drawing>
+      </w:r>
+      <w:r>
+        <w:rPr>
+          <w:noProof/>
+        </w:rPr>
+        <w:t xml:space="preserve">        </w:t>
+      </w:r>
+      <w:r>
+        <w:rPr>
+          <w:noProof/>
+        </w:rPr>
+        <w:drawing>
+          <wp:inline distT="0" distB="0" distL="0" distR="0" wp14:anchorId="6BC12CFB" wp14:editId="5BE22AF6">
+            <wp:extent cx="1676400" cy="3467100"/>
+            <wp:effectExtent l="0" t="0" r="0" b="0"/>
+            <wp:docPr id="1899923467" name="Picture 7"/>
+            <wp:cNvGraphicFramePr>
+              <a:graphicFrameLocks xmlns:a="http://schemas.openxmlformats.org/drawingml/2006/main" noChangeAspect="1"/>
+            </wp:cNvGraphicFramePr>
+            <a:graphic xmlns:a="http://schemas.openxmlformats.org/drawingml/2006/main">
+              <a:graphicData uri="http://schemas.openxmlformats.org/drawingml/2006/picture">
+                <pic:pic xmlns:pic="http://schemas.openxmlformats.org/drawingml/2006/picture">
+                  <pic:nvPicPr>
+                    <pic:cNvPr id="0" name="Picture 4"/>
+                    <pic:cNvPicPr>
+                      <a:picLocks noChangeAspect="1" noChangeArrowheads="1"/>
+                    </pic:cNvPicPr>
+                  </pic:nvPicPr>
+                  <pic:blipFill rotWithShape="1">
+                    <a:blip r:embed="rId14" cstate="print">
+                      <a:extLst>
+                        <a:ext uri="{28A0092B-C50C-407E-A947-70E740481C1C}">
+                          <a14:useLocalDpi xmlns:a14="http://schemas.microsoft.com/office/drawing/2010/main" val="0"/>
+                        </a:ext>
+                      </a:extLst>
+                    </a:blip>
+                    <a:srcRect l="4712" t="549" r="3130" b="-329"/>
+                    <a:stretch>
+                      <a:fillRect/>
+                    </a:stretch>
+                  </pic:blipFill>
+                  <pic:spPr bwMode="auto">
+                    <a:xfrm>
+                      <a:off x="0" y="0"/>
+                      <a:ext cx="1683697" cy="3482192"/>
+                    </a:xfrm>
+                    <a:prstGeom prst="rect">
+                      <a:avLst/>
+                    </a:prstGeom>
+                    <a:noFill/>
+                    <a:ln>
+                      <a:noFill/>
+                    </a:ln>
+                    <a:extLst>
+                      <a:ext uri="{53640926-AAD7-44D8-BBD7-CCE9431645EC}">
+                        <a14:shadowObscured xmlns:a14="http://schemas.microsoft.com/office/drawing/2010/main"/>
+                      </a:ext>
+                    </a:extLst>
+                  </pic:spPr>
+                </pic:pic>
+              </a:graphicData>
+            </a:graphic>
+          </wp:inline>
+        </w:drawing>
+      </w:r>
+    </w:p>
+    <w:p>
+      <w:pPr>
+        <w:pStyle w:val="Heading1"/>
+      </w:pPr>
     </w:p>
     <w:p>
       <w:pPr>
@@ -1180,7 +1581,6 @@
     <w:p>
       <w:pPr>
         <w:spacing w:before="60" w:after="60"/>
-        <w:ind w:left="270"/>
       </w:pPr>
       <w:r>
         <w:rPr>
@@ -1190,7 +1590,7 @@
           <w:sz w:val="19"/>
           <w:szCs w:val="19"/>
         </w:rPr>
-        <w:t>→ Show thought leadership: novel combinations, creative use of algo/tech, not just standard CRUD.</w:t>
+        <w:t>.</w:t>
       </w:r>
     </w:p>
     <w:p>
@@ -1209,28 +1609,13 @@
         <w:t>Everything stateful is managed (DynamoDB, S3, OpenSearch) and everything compute is stateless (Lambda behind SQS), so handling 100x to 1000x more returns is a quota request, not a redesign. Bedrock absorbs the model load, queues and dead letter queues absorb spikes, presigned uploads keep images off the API path, and cached results with pre-warmed models keep latency flat. Cost is pay per return with near zero idle, which matches a workload that spikes after every holiday.</w:t>
       </w:r>
     </w:p>
-    <w:p>
-      <w:pPr>
-        <w:spacing w:before="60" w:after="60"/>
-        <w:ind w:left="270"/>
-      </w:pPr>
-      <w:r>
-        <w:rPr>
-          <w:i/>
-          <w:iCs/>
-          <w:color w:val="999999"/>
-          <w:sz w:val="19"/>
-          <w:szCs w:val="19"/>
-        </w:rPr>
-        <w:t>→ Solutions restricted to local functionality score low. Show global scalability.</w:t>
-      </w:r>
-    </w:p>
     <w:p/>
     <w:p>
       <w:pPr>
         <w:pStyle w:val="Heading1"/>
       </w:pPr>
       <w:r>
+        <w:lastRenderedPageBreak/>
         <w:t>4. Future Vision</w:t>
       </w:r>
     </w:p>
@@ -1573,12 +1958,24 @@
       <w:r>
         <w:t xml:space="preserve">Links: GitHub </w:t>
       </w:r>
-      <w:hyperlink r:id="rId9" w:history="1">
+      <w:hyperlink r:id="rId15" w:history="1">
         <w:r>
           <w:rPr>
             <w:rStyle w:val="Hyperlink"/>
           </w:rPr>
-          <w:t>https://github.com/UdaiBatt</w:t>
+          <w:t>https://github.com/Ud</w:t>
+        </w:r>
+        <w:r>
+          <w:rPr>
+            <w:rStyle w:val="Hyperlink"/>
+          </w:rPr>
+          <w:t>a</w:t>
+        </w:r>
+        <w:r>
+          <w:rPr>
+            <w:rStyle w:val="Hyperlink"/>
+          </w:rPr>
+          <w:t>iBatt</w:t>
         </w:r>
         <w:r>
           <w:rPr>
@@ -1597,12 +1994,54 @@
         <w:t xml:space="preserve"> </w:t>
       </w:r>
       <w:r>
-        <w:t>|  Demo Video to be added  |  Live App to be added</w:t>
-      </w:r>
+        <w:t xml:space="preserve">| </w:t>
+      </w:r>
+    </w:p>
+    <w:p>
+      <w:pPr>
+        <w:spacing w:after="60"/>
+      </w:pPr>
+      <w:r>
+        <w:t xml:space="preserve">Demo Video </w:t>
+      </w:r>
+      <w:r>
+        <w:t xml:space="preserve">link - </w:t>
+      </w:r>
+    </w:p>
+    <w:p>
+      <w:pPr>
+        <w:spacing w:after="60"/>
+      </w:pPr>
+      <w:r>
+        <w:t>Live App</w:t>
+      </w:r>
+      <w:r>
+        <w:t xml:space="preserve"> link - </w:t>
+      </w:r>
+      <w:hyperlink r:id="rId16" w:history="1">
+        <w:r>
+          <w:rPr>
+            <w:rStyle w:val="Hyperlink"/>
+          </w:rPr>
+          <w:t>https://amazonhackon-one.ver</w:t>
+        </w:r>
+        <w:r>
+          <w:rPr>
+            <w:rStyle w:val="Hyperlink"/>
+          </w:rPr>
+          <w:t>c</w:t>
+        </w:r>
+        <w:r>
+          <w:rPr>
+            <w:rStyle w:val="Hyperlink"/>
+          </w:rPr>
+          <w:t>el.app/</w:t>
+        </w:r>
+      </w:hyperlink>
     </w:p>
     <w:sectPr>
-      <w:headerReference w:type="default" r:id="rId10"/>
-      <w:footerReference w:type="default" r:id="rId11"/>
+      <w:headerReference w:type="default" r:id="rId17"/>
+      <w:footerReference w:type="default" r:id="rId18"/>
       <w:pgSz w:w="11906" w:h="16838"/>
       <w:pgMar w:top="1200" w:right="1200" w:bottom="1200" w:left="1200" w:header="708" w:footer="708" w:gutter="0"/>
       <w:cols w:space="720"/>
@@ -2507,6 +2946,50 @@
       <w:u w:val="single"/>
     </w:rPr>
   </w:style>
+  <w:style w:type="paragraph" w:styleId="Header">
+    <w:name w:val="header"/>
+    <w:basedOn w:val="Normal"/>
+    <w:link w:val="HeaderChar"/>
+    <w:uiPriority w:val="99"/>
+    <w:unhideWhenUsed/>
+    <w:rsid w:val="007C75C1"/>
+    <w:pPr>
+      <w:tabs>
+        <w:tab w:val="center" w:pos="4513"/>
+        <w:tab w:val="right" w:pos="9026"/>
+      </w:tabs>
+      <w:spacing w:after="0" w:line="240" w:lineRule="auto"/>
+    </w:pPr>
+  </w:style>
+  <w:style w:type="character" w:customStyle="1" w:styleId="HeaderChar">
+    <w:name w:val="Header Char"/>
+    <w:basedOn w:val="DefaultParagraphFont"/>
+    <w:link w:val="Header"/>
+    <w:uiPriority w:val="99"/>
+    <w:rsid w:val="007C75C1"/>
+  </w:style>
+  <w:style w:type="paragraph" w:styleId="Footer">
+    <w:name w:val="footer"/>
+    <w:basedOn w:val="Normal"/>
+    <w:link w:val="FooterChar"/>
+    <w:uiPriority w:val="99"/>
+    <w:unhideWhenUsed/>
+    <w:rsid w:val="007C75C1"/>
+    <w:pPr>
+      <w:tabs>
+        <w:tab w:val="center" w:pos="4513"/>
+        <w:tab w:val="right" w:pos="9026"/>
+      </w:tabs>
+      <w:spacing w:after="0" w:line="240" w:lineRule="auto"/>
+    </w:pPr>
+  </w:style>
+  <w:style w:type="character" w:customStyle="1" w:styleId="FooterChar">
+    <w:name w:val="Footer Char"/>
+    <w:basedOn w:val="DefaultParagraphFont"/>
+    <w:link w:val="Footer"/>
+    <w:uiPriority w:val="99"/>
+    <w:rsid w:val="007C75C1"/>
+  </w:style>
 </w:styles>
 </file>
 

</xml_diff>

<commit_message>
Add demo video link and update PRD document
</commit_message>
<xml_diff>
--- a/PRD Document.docx
+++ b/PRD Document.docx
@@ -1057,7 +1057,7 @@
           </mc:Choice>
           <mc:Fallback>
             <w:pict>
-              <v:rect w14:anchorId="034049CE" id="Rectangle 1" o:spid="_x0000_s1026" style="width:24pt;height:24pt;visibility:visible;mso-wrap-style:square;mso-left-percent:-10001;mso-top-percent:-10001;mso-position-horizontal:absolute;mso-position-horizontal-relative:char;mso-position-vertical:absolute;mso-position-vertical-relative:line;mso-left-percent:-10001;mso-top-percent:-10001;v-text-anchor:top" o:gfxdata="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" filled="f" stroked="f">
+              <v:rect w14:anchorId="68E56856" id="Rectangle 1" o:spid="_x0000_s1026" style="width:24pt;height:24pt;visibility:visible;mso-wrap-style:square;mso-left-percent:-10001;mso-top-percent:-10001;mso-position-horizontal:absolute;mso-position-horizontal-relative:char;mso-position-vertical:absolute;mso-position-vertical-relative:line;mso-left-percent:-10001;mso-top-percent:-10001;v-text-anchor:top" o:gfxdata="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" filled="f" stroked="f">
                 <o:lock v:ext="edit" aspectratio="t"/>
                 <w10:anchorlock/>
               </v:rect>
@@ -2007,6 +2007,14 @@
       <w:r>
         <w:t xml:space="preserve">link - </w:t>
       </w:r>
+      <w:hyperlink r:id="rId16" w:history="1">
+        <w:r>
+          <w:rPr>
+            <w:rStyle w:val="Hyperlink"/>
+          </w:rPr>
+          <w:t>https://youtu.be/89pVGSbFN6c?si=X2AI7cxgYVGlauWG</w:t>
+        </w:r>
+      </w:hyperlink>
     </w:p>
     <w:p>
       <w:pPr>
@@ -2018,7 +2026,7 @@
       <w:r>
         <w:t xml:space="preserve"> link - </w:t>
       </w:r>
-      <w:hyperlink r:id="rId16" w:history="1">
+      <w:hyperlink r:id="rId17" w:history="1">
         <w:r>
           <w:rPr>
             <w:rStyle w:val="Hyperlink"/>
@@ -2040,8 +2048,8 @@
       </w:hyperlink>
     </w:p>
     <w:sectPr>
-      <w:headerReference w:type="default" r:id="rId17"/>
-      <w:footerReference w:type="default" r:id="rId18"/>
+      <w:headerReference w:type="default" r:id="rId18"/>
+      <w:footerReference w:type="default" r:id="rId19"/>
       <w:pgSz w:w="11906" w:h="16838"/>
       <w:pgMar w:top="1200" w:right="1200" w:bottom="1200" w:left="1200" w:header="708" w:footer="708" w:gutter="0"/>
       <w:cols w:space="720"/>

</xml_diff>